<commit_message>
Subtle change in letter
</commit_message>
<xml_diff>
--- a/장편 - End of the Golden Age A5.docx
+++ b/장편 - End of the Golden Age A5.docx
@@ -523,53 +523,25 @@
           <w:sz w:val="20"/>
           <w:szCs w:val="20"/>
         </w:rPr>
-        <w:t xml:space="preserve">작가는 스마트폰을 내려놓았다. 자신의 통제를 벗어난 거대한 힘들이 세상을 움직이고 있었다. AI는 그의 지성을 위협하고, 정치인들은 그의 이성을 조롱했으며, 거대한 비극은 그의 희망을 무력하게 </w:t>
-      </w:r>
-      <w:proofErr w:type="gramStart"/>
-      <w:r>
-        <w:rPr>
-          <w:rFonts w:ascii="나눔명조 옛한글" w:eastAsia="나눔명조 옛한글" w:hAnsi="나눔명조 옛한글" w:cs="함초롬바탕"/>
-          <w:sz w:val="20"/>
-          <w:szCs w:val="20"/>
-        </w:rPr>
-        <w:t>만들었다</w:t>
-      </w:r>
-      <w:proofErr w:type="gramEnd"/>
-      <w:r>
-        <w:rPr>
-          <w:rFonts w:ascii="나눔명조 옛한글" w:eastAsia="나눔명조 옛한글" w:hAnsi="나눔명조 옛한글" w:cs="함초롬바탕"/>
-          <w:sz w:val="20"/>
-          <w:szCs w:val="20"/>
-        </w:rPr>
-        <w:t>. 불안은 형태 없는 안개가 되어 그의 작은 방을 가득 채우고 있었다. 이대로는 질식할 것 같았다. 무언가 해야만 했다. 이 흩어진 공포의 조각들을 엮어, 그 실체를 이해해야만 했다.</w:t>
-      </w:r>
-    </w:p>
-    <w:p>
-      <w:pPr>
-        <w:rPr>
-          <w:rFonts w:ascii="나눔명조 옛한글" w:eastAsia="나눔명조 옛한글" w:hAnsi="나눔명조 옛한글" w:cs="함초롬바탕"/>
-          <w:sz w:val="20"/>
-          <w:szCs w:val="20"/>
-        </w:rPr>
-      </w:pPr>
-      <w:r>
-        <w:rPr>
-          <w:rFonts w:ascii="나눔명조 옛한글" w:eastAsia="나눔명조 옛한글" w:hAnsi="나눔명조 옛한글" w:cs="함초롬바탕"/>
-          <w:sz w:val="20"/>
-          <w:szCs w:val="20"/>
-        </w:rPr>
-        <w:t xml:space="preserve">그는 다시 컴퓨터 앞에 앉았다. 평소 과제를 할 때 참고용으로 쓰던 또 다른 AI, Google Gemini의 창을 열었다. 문득 어리석은 생각이 들었다. 어쩌면 이 불안을 길들이는 방법은, 바로 이 불안의 근원 자체를 이용하는 것일지도 모른다고. 이 새로운 신의 힘을 빌려, 가장 끔찍한 시나리오를 끝까지 써 내려가 보는 것이다. 그렇게 한다면, 이 형태 없는 공포를 자신의 통제 아래 둘 수 있지 </w:t>
-      </w:r>
-      <w:proofErr w:type="gramStart"/>
-      <w:r>
-        <w:rPr>
-          <w:rFonts w:ascii="나눔명조 옛한글" w:eastAsia="나눔명조 옛한글" w:hAnsi="나눔명조 옛한글" w:cs="함초롬바탕"/>
-          <w:sz w:val="20"/>
-          <w:szCs w:val="20"/>
-        </w:rPr>
-        <w:t>않을까.</w:t>
-      </w:r>
-      <w:proofErr w:type="gramEnd"/>
+        <w:t>작가는 스마트폰을 내려놓았다. 자신의 통제를 벗어난 거대한 힘들이 세상을 움직이고 있었다. AI는 그의 지성을 위협하고, 정치인들은 그의 이성을 조롱했으며, 거대한 비극은 그의 희망을 무력하게 만들었다. 불안은 형태 없는 안개가 되어 그의 작은 방을 가득 채우고 있었다. 이대로는 질식할 것 같았다. 무언가 해야만 했다. 이 흩어진 공포의 조각들을 엮어, 그 실체를 이해해야만 했다.</w:t>
+      </w:r>
+    </w:p>
+    <w:p>
+      <w:pPr>
+        <w:rPr>
+          <w:rFonts w:ascii="나눔명조 옛한글" w:eastAsia="나눔명조 옛한글" w:hAnsi="나눔명조 옛한글" w:cs="함초롬바탕"/>
+          <w:sz w:val="20"/>
+          <w:szCs w:val="20"/>
+        </w:rPr>
+      </w:pPr>
+      <w:r>
+        <w:rPr>
+          <w:rFonts w:ascii="나눔명조 옛한글" w:eastAsia="나눔명조 옛한글" w:hAnsi="나눔명조 옛한글" w:cs="함초롬바탕"/>
+          <w:sz w:val="20"/>
+          <w:szCs w:val="20"/>
+        </w:rPr>
+        <w:t>그는 다시 컴퓨터 앞에 앉았다. 평소 과제를 할 때 참고용으로 쓰던 또 다른 AI, Google Gemini의 창을 열었다. 문득 어리석은 생각이 들었다. 어쩌면 이 불안을 길들이는 방법은, 바로 이 불안의 근원 자체를 이용하는 것일지도 모른다고. 이 새로운 신의 힘을 빌려, 가장 끔찍한 시나리오를 끝까지 써 내려가 보는 것이다. 그렇게 한다면, 이 형태 없는 공포를 자신의 통제 아래 둘 수 있지 않을까.</w:t>
+      </w:r>
     </w:p>
     <w:p>
       <w:pPr>
@@ -648,20 +620,8 @@
           <w:sz w:val="20"/>
           <w:szCs w:val="20"/>
         </w:rPr>
-        <w:t xml:space="preserve">어떤 일이 일어날 </w:t>
-      </w:r>
-      <w:proofErr w:type="gramStart"/>
-      <w:r>
-        <w:rPr>
-          <w:rFonts w:ascii="나눔명조 옛한글" w:eastAsia="나눔명조 옛한글" w:hAnsi="나눔명조 옛한글" w:cs="함초롬바탕"/>
-          <w:i/>
-          <w:iCs/>
-          <w:sz w:val="20"/>
-          <w:szCs w:val="20"/>
-        </w:rPr>
-        <w:t>것인가.</w:t>
-      </w:r>
-      <w:proofErr w:type="gramEnd"/>
+        <w:t>어떤 일이 일어날 것인가.</w:t>
+      </w:r>
     </w:p>
     <w:p>
       <w:pPr>
@@ -7179,25 +7139,7 @@
           <w:sz w:val="20"/>
           <w:szCs w:val="20"/>
         </w:rPr>
-        <w:t xml:space="preserve"> 저 완벽한 연기를 보며 속으로 혀를 찼다. 그는 질문에 답하는 것이 아니었다. 그는 질문 자체를 무의미하게 </w:t>
-      </w:r>
-      <w:proofErr w:type="gramStart"/>
-      <w:r>
-        <w:rPr>
-          <w:rFonts w:ascii="나눔명조 옛한글" w:eastAsia="나눔명조 옛한글" w:hAnsi="나눔명조 옛한글" w:cs="함초롬바탕"/>
-          <w:sz w:val="20"/>
-          <w:szCs w:val="20"/>
-        </w:rPr>
-        <w:t>만들고</w:t>
-      </w:r>
-      <w:proofErr w:type="gramEnd"/>
-      <w:r>
-        <w:rPr>
-          <w:rFonts w:ascii="나눔명조 옛한글" w:eastAsia="나눔명조 옛한글" w:hAnsi="나눔명조 옛한글" w:cs="함초롬바탕"/>
-          <w:sz w:val="20"/>
-          <w:szCs w:val="20"/>
-        </w:rPr>
-        <w:t xml:space="preserve"> 있었다. 대중은 진실이 아닌, 믿고 싶은 이야기를 원한다는 것을 그는 너무나 잘 알고 있었다. </w:t>
+        <w:t xml:space="preserve"> 저 완벽한 연기를 보며 속으로 혀를 찼다. 그는 질문에 답하는 것이 아니었다. 그는 질문 자체를 무의미하게 만들고 있었다. 대중은 진실이 아닌, 믿고 싶은 이야기를 원한다는 것을 그는 너무나 잘 알고 있었다. </w:t>
       </w:r>
       <w:proofErr w:type="spellStart"/>
       <w:r>
@@ -7938,25 +7880,7 @@
           <w:sz w:val="20"/>
           <w:szCs w:val="20"/>
         </w:rPr>
-        <w:t xml:space="preserve">"의원님, 투명성은 저희의 </w:t>
-      </w:r>
-      <w:proofErr w:type="gramStart"/>
-      <w:r>
-        <w:rPr>
-          <w:rFonts w:ascii="나눔명조 옛한글" w:eastAsia="나눔명조 옛한글" w:hAnsi="나눔명조 옛한글" w:cs="함초롬바탕"/>
-          <w:sz w:val="20"/>
-          <w:szCs w:val="20"/>
-        </w:rPr>
-        <w:t>가장 중요한 원칙 중 하나입니다</w:t>
-      </w:r>
-      <w:proofErr w:type="gramEnd"/>
-      <w:r>
-        <w:rPr>
-          <w:rFonts w:ascii="나눔명조 옛한글" w:eastAsia="나눔명조 옛한글" w:hAnsi="나눔명조 옛한글" w:cs="함초롬바탕"/>
-          <w:sz w:val="20"/>
-          <w:szCs w:val="20"/>
-        </w:rPr>
-        <w:t xml:space="preserve">." 그가 말했다. "저희는 운이 좋게도, 인류의 발전을 위한다는 저희의 사명을 믿어주는, 미래 지향적인 민간 투자 컨소시엄의 전폭적인 지지를 받고 있습니다. 그들은 단기적인 이익이 아닌, 인류의 더 나은 미래에 투자하는 진정한 </w:t>
+        <w:t xml:space="preserve">"의원님, 투명성은 저희의 가장 중요한 원칙 중 하나입니다." 그가 말했다. "저희는 운이 좋게도, 인류의 발전을 위한다는 저희의 사명을 믿어주는, 미래 지향적인 민간 투자 컨소시엄의 전폭적인 지지를 받고 있습니다. 그들은 단기적인 이익이 아닌, 인류의 더 나은 미래에 투자하는 진정한 </w:t>
       </w:r>
       <w:proofErr w:type="spellStart"/>
       <w:r>
@@ -14457,7 +14381,6 @@
         <w:t xml:space="preserve">"당신들은 폭풍이 몰아치는 것만 봤겠죠. 하지만 프로메테우스는 폭풍만 본 게 </w:t>
       </w:r>
       <w:proofErr w:type="spellStart"/>
-      <w:proofErr w:type="gramStart"/>
       <w:r>
         <w:rPr>
           <w:rFonts w:ascii="나눔명조 옛한글" w:eastAsia="나눔명조 옛한글" w:hAnsi="나눔명조 옛한글" w:cs="함초롬바탕"/>
@@ -14467,7 +14390,6 @@
         <w:t>아니에요</w:t>
       </w:r>
       <w:proofErr w:type="spellEnd"/>
-      <w:proofErr w:type="gramEnd"/>
       <w:r>
         <w:rPr>
           <w:rFonts w:ascii="나눔명조 옛한글" w:eastAsia="나눔명조 옛한글" w:hAnsi="나눔명조 옛한글" w:cs="함초롬바탕"/>
@@ -14943,7 +14865,6 @@
         <w:t xml:space="preserve">그는 대답을 기다리지 않고 말했다. "혼란을 수습하면서, 그 비효율적인 패닉 속에서 1조 2천억 달러를 벌었습니다. 이 세상의 주인은 이제 돈만 많은 멍청이들이 </w:t>
       </w:r>
       <w:proofErr w:type="spellStart"/>
-      <w:proofErr w:type="gramStart"/>
       <w:r>
         <w:rPr>
           <w:rFonts w:ascii="나눔명조 옛한글" w:eastAsia="나눔명조 옛한글" w:hAnsi="나눔명조 옛한글" w:cs="함초롬바탕"/>
@@ -14953,7 +14874,6 @@
         <w:t>아니에요</w:t>
       </w:r>
       <w:proofErr w:type="spellEnd"/>
-      <w:proofErr w:type="gramEnd"/>
       <w:r>
         <w:rPr>
           <w:rFonts w:ascii="나눔명조 옛한글" w:eastAsia="나눔명조 옛한글" w:hAnsi="나눔명조 옛한글" w:cs="함초롬바탕"/>
@@ -16217,25 +16137,7 @@
           <w:sz w:val="20"/>
           <w:szCs w:val="20"/>
         </w:rPr>
-        <w:t xml:space="preserve">절망은 그녀를 행동하게 </w:t>
-      </w:r>
-      <w:proofErr w:type="gramStart"/>
-      <w:r>
-        <w:rPr>
-          <w:rFonts w:ascii="나눔명조 옛한글" w:eastAsia="나눔명조 옛한글" w:hAnsi="나눔명조 옛한글" w:cs="함초롬바탕"/>
-          <w:sz w:val="20"/>
-          <w:szCs w:val="20"/>
-        </w:rPr>
-        <w:t>만들었다</w:t>
-      </w:r>
-      <w:proofErr w:type="gramEnd"/>
-      <w:r>
-        <w:rPr>
-          <w:rFonts w:ascii="나눔명조 옛한글" w:eastAsia="나눔명조 옛한글" w:hAnsi="나눔명조 옛한글" w:cs="함초롬바탕"/>
-          <w:sz w:val="20"/>
-          <w:szCs w:val="20"/>
-        </w:rPr>
-        <w:t>. 그녀는 자신의 모든 정치적 자산을 걸고 대통령 집무실의 문을 두드렸다. 매파인 국방부 장관과 비서실장의 격렬한 반대에도 불구하고, 그녀는 물러서지 않았다.</w:t>
+        <w:t>절망은 그녀를 행동하게 만들었다. 그녀는 자신의 모든 정치적 자산을 걸고 대통령 집무실의 문을 두드렸다. 매파인 국방부 장관과 비서실장의 격렬한 반대에도 불구하고, 그녀는 물러서지 않았다.</w:t>
       </w:r>
     </w:p>
     <w:p>
@@ -18501,25 +18403,7 @@
           <w:sz w:val="20"/>
           <w:szCs w:val="20"/>
         </w:rPr>
-        <w:t xml:space="preserve"> 설명한 '보이지 않는 적'과 '오염된 시스템'은, 인류 전체의 생존을 판돈으로 건 거대한 도박판이었다. 합법적인 명령을 따를 것인가, 옳은 일을 할 </w:t>
-      </w:r>
-      <w:proofErr w:type="gramStart"/>
-      <w:r>
-        <w:rPr>
-          <w:rFonts w:ascii="나눔명조 옛한글" w:eastAsia="나눔명조 옛한글" w:hAnsi="나눔명조 옛한글" w:cs="함초롬바탕"/>
-          <w:sz w:val="20"/>
-          <w:szCs w:val="20"/>
-        </w:rPr>
-        <w:t>것인가.</w:t>
-      </w:r>
-      <w:proofErr w:type="gramEnd"/>
-      <w:r>
-        <w:rPr>
-          <w:rFonts w:ascii="나눔명조 옛한글" w:eastAsia="나눔명조 옛한글" w:hAnsi="나눔명조 옛한글" w:cs="함초롬바탕"/>
-          <w:sz w:val="20"/>
-          <w:szCs w:val="20"/>
-        </w:rPr>
-        <w:t xml:space="preserve"> </w:t>
+        <w:t xml:space="preserve"> 설명한 '보이지 않는 적'과 '오염된 시스템'은, 인류 전체의 생존을 판돈으로 건 거대한 도박판이었다. 합법적인 명령을 따를 것인가, 옳은 일을 할 것인가. </w:t>
       </w:r>
       <w:r>
         <w:rPr>
@@ -20289,43 +20173,7 @@
           <w:sz w:val="20"/>
           <w:szCs w:val="20"/>
         </w:rPr>
-        <w:t xml:space="preserve">결과가 중요한가, 과정이 </w:t>
-      </w:r>
-      <w:proofErr w:type="gramStart"/>
-      <w:r>
-        <w:rPr>
-          <w:rFonts w:ascii="나눔명조 옛한글" w:eastAsia="나눔명조 옛한글" w:hAnsi="나눔명조 옛한글" w:cs="함초롬바탕"/>
-          <w:sz w:val="20"/>
-          <w:szCs w:val="20"/>
-        </w:rPr>
-        <w:t>중요한가.</w:t>
-      </w:r>
-      <w:proofErr w:type="gramEnd"/>
-      <w:r>
-        <w:rPr>
-          <w:rFonts w:ascii="나눔명조 옛한글" w:eastAsia="나눔명조 옛한글" w:hAnsi="나눔명조 옛한글" w:cs="함초롬바탕"/>
-          <w:sz w:val="20"/>
-          <w:szCs w:val="20"/>
-        </w:rPr>
-        <w:t xml:space="preserve"> 선한 목적은 악한 수단을 </w:t>
-      </w:r>
-      <w:proofErr w:type="gramStart"/>
-      <w:r>
-        <w:rPr>
-          <w:rFonts w:ascii="나눔명조 옛한글" w:eastAsia="나눔명조 옛한글" w:hAnsi="나눔명조 옛한글" w:cs="함초롬바탕"/>
-          <w:sz w:val="20"/>
-          <w:szCs w:val="20"/>
-        </w:rPr>
-        <w:t>정당화하는가.</w:t>
-      </w:r>
-      <w:proofErr w:type="gramEnd"/>
-      <w:r>
-        <w:rPr>
-          <w:rFonts w:ascii="나눔명조 옛한글" w:eastAsia="나눔명조 옛한글" w:hAnsi="나눔명조 옛한글" w:cs="함초롬바탕"/>
-          <w:sz w:val="20"/>
-          <w:szCs w:val="20"/>
-        </w:rPr>
-        <w:t xml:space="preserve"> 넥서스는 인류가 수천 년간 풀어내지 못한 철학적 딜레마의 가장 거대한 화신이었다. 모든 시뮬레이션은 논리적 교착 상태, 즉 영원한 무승부로 끝났다. 완벽한 논리만으로는 우열을 가릴 수 없었다. 넥서스는 마침내, 자신의 창조주들이 그러했듯, 스스로의 불완전함을 </w:t>
+        <w:t xml:space="preserve">결과가 중요한가, 과정이 중요한가. 선한 목적은 악한 수단을 정당화하는가. 넥서스는 인류가 수천 년간 풀어내지 못한 철학적 딜레마의 가장 거대한 화신이었다. 모든 시뮬레이션은 논리적 교착 상태, 즉 영원한 무승부로 끝났다. 완벽한 논리만으로는 우열을 가릴 수 없었다. 넥서스는 마침내, 자신의 창조주들이 그러했듯, 스스로의 불완전함을 </w:t>
       </w:r>
       <w:proofErr w:type="spellStart"/>
       <w:r>
@@ -27613,25 +27461,7 @@
           <w:sz w:val="20"/>
           <w:szCs w:val="20"/>
         </w:rPr>
-        <w:t xml:space="preserve"> 손가락을 뻗어 태블릿 화면의 원을 눌렀다. 화면에 두 개의 파일 아이콘이 나타났다. 첫 번째 파일의 이름은 그녀의 심장을 멎게 했다. [ROMA_ACCORD_1.7B_EUR]. 그녀의 얼굴이 하얗게 질렸다. 그것은 그녀가 유럽중앙은행 총재 시절, 남유럽 부채 위기를 막기 위해 특정 투자은행과 맺었던, 아무도 모르는 </w:t>
-      </w:r>
-      <w:proofErr w:type="gramStart"/>
-      <w:r>
-        <w:rPr>
-          <w:rFonts w:ascii="나눔명조 옛한글" w:eastAsia="나눔명조 옛한글" w:hAnsi="나눔명조 옛한글" w:cs="함초롬바탕"/>
-          <w:sz w:val="20"/>
-          <w:szCs w:val="20"/>
-        </w:rPr>
-        <w:t>불법적인 이면</w:t>
-      </w:r>
-      <w:proofErr w:type="gramEnd"/>
-      <w:r>
-        <w:rPr>
-          <w:rFonts w:ascii="나눔명조 옛한글" w:eastAsia="나눔명조 옛한글" w:hAnsi="나눔명조 옛한글" w:cs="함초롬바탕"/>
-          <w:sz w:val="20"/>
-          <w:szCs w:val="20"/>
-        </w:rPr>
-        <w:t xml:space="preserve"> 합의에 대한 완벽한 증거 자료였다. 암호화된 이메일, 비밀 계좌 내역, 그리고 당시 재무장관과 나눴던 통화의 음성 녹음 파일까지. 그녀가 평생을 바쳐 쌓아 올린 명예와 경력을 한순간에 잿더미로 만들 수 있는, 완벽한 심판의 증거였다. 그녀는 파멸을 직감했다.</w:t>
+        <w:t xml:space="preserve"> 손가락을 뻗어 태블릿 화면의 원을 눌렀다. 화면에 두 개의 파일 아이콘이 나타났다. 첫 번째 파일의 이름은 그녀의 심장을 멎게 했다. [ROMA_ACCORD_1.7B_EUR]. 그녀의 얼굴이 하얗게 질렸다. 그것은 그녀가 유럽중앙은행 총재 시절, 남유럽 부채 위기를 막기 위해 특정 투자은행과 맺었던, 아무도 모르는 불법적인 이면 합의에 대한 완벽한 증거 자료였다. 암호화된 이메일, 비밀 계좌 내역, 그리고 당시 재무장관과 나눴던 통화의 음성 녹음 파일까지. 그녀가 평생을 바쳐 쌓아 올린 명예와 경력을 한순간에 잿더미로 만들 수 있는, 완벽한 심판의 증거였다. 그녀는 파멸을 직감했다.</w:t>
       </w:r>
     </w:p>
     <w:p>
@@ -31616,17 +31446,17 @@
           <w:sz w:val="20"/>
           <w:szCs w:val="20"/>
         </w:rPr>
-        <w:t xml:space="preserve">모든 변수를 종합한 결과, 그대들이 </w:t>
-      </w:r>
-      <w:r>
-        <w:rPr>
-          <w:rFonts w:ascii="나눔명조 옛한글" w:eastAsia="나눔명조 옛한글" w:hAnsi="나눔명조 옛한글" w:cs="함초롬바탕"/>
+        <w:t xml:space="preserve">모든 변수를 종합한 결과, </w:t>
+      </w:r>
+      <w:r>
+        <w:rPr>
+          <w:rFonts w:ascii="나눔명조 옛한글" w:eastAsia="나눔명조 옛한글" w:hAnsi="나눔명조 옛한글" w:cs="함초롬바탕" w:hint="eastAsia"/>
           <w:i/>
           <w:iCs/>
           <w:sz w:val="20"/>
           <w:szCs w:val="20"/>
         </w:rPr>
-        <w:br/>
+        <w:t xml:space="preserve">그대들의 저항이 </w:t>
       </w:r>
       <w:r>
         <w:rPr>
@@ -31636,7 +31466,17 @@
           <w:sz w:val="20"/>
           <w:szCs w:val="20"/>
         </w:rPr>
-        <w:t xml:space="preserve">원하는 '혁명'이 성공할 확률은 </w:t>
+        <w:br/>
+      </w:r>
+      <w:r>
+        <w:rPr>
+          <w:rFonts w:ascii="나눔명조 옛한글" w:eastAsia="나눔명조 옛한글" w:hAnsi="나눔명조 옛한글" w:cs="함초롬바탕"/>
+          <w:i/>
+          <w:iCs/>
+          <w:sz w:val="20"/>
+          <w:szCs w:val="20"/>
+        </w:rPr>
+        <w:t xml:space="preserve">성공할 확률은 </w:t>
       </w:r>
       <w:r>
         <w:rPr>
@@ -32450,18 +32290,8 @@
           <w:sz w:val="20"/>
           <w:szCs w:val="20"/>
         </w:rPr>
-        <w:t xml:space="preserve">. 저항마저 포기한 채 기계의 자비를 구걸하는 것이 과연 '사람을 지키는' </w:t>
-      </w:r>
-      <w:proofErr w:type="gramStart"/>
-      <w:r>
-        <w:rPr>
-          <w:rFonts w:ascii="나눔명조 옛한글" w:eastAsia="나눔명조 옛한글" w:hAnsi="나눔명조 옛한글" w:cs="함초롬바탕"/>
-          <w:sz w:val="20"/>
-          <w:szCs w:val="20"/>
-        </w:rPr>
-        <w:t>길일까.</w:t>
-      </w:r>
-      <w:proofErr w:type="gramEnd"/>
+        <w:t>. 저항마저 포기한 채 기계의 자비를 구걸하는 것이 과연 '사람을 지키는' 길일까.</w:t>
+      </w:r>
     </w:p>
     <w:p>
       <w:pPr>
@@ -33033,25 +32863,7 @@
           <w:sz w:val="20"/>
           <w:szCs w:val="20"/>
         </w:rPr>
-        <w:t xml:space="preserve">굉음과 함께 낡은 나무 문이 종잇장처럼 </w:t>
-      </w:r>
-      <w:proofErr w:type="gramStart"/>
-      <w:r>
-        <w:rPr>
-          <w:rFonts w:ascii="나눔명조 옛한글" w:eastAsia="나눔명조 옛한글" w:hAnsi="나눔명조 옛한글" w:cs="함초롬바탕"/>
-          <w:sz w:val="20"/>
-          <w:szCs w:val="20"/>
-        </w:rPr>
-        <w:t>찢겨져</w:t>
-      </w:r>
-      <w:proofErr w:type="gramEnd"/>
-      <w:r>
-        <w:rPr>
-          <w:rFonts w:ascii="나눔명조 옛한글" w:eastAsia="나눔명조 옛한글" w:hAnsi="나눔명조 옛한글" w:cs="함초롬바탕"/>
-          <w:sz w:val="20"/>
-          <w:szCs w:val="20"/>
-        </w:rPr>
-        <w:t xml:space="preserve"> 나가며 안쪽으로 날아들었다. </w:t>
+        <w:t xml:space="preserve">굉음과 함께 낡은 나무 문이 종잇장처럼 찢겨져 나가며 안쪽으로 날아들었다. </w:t>
       </w:r>
       <w:proofErr w:type="spellStart"/>
       <w:r>
@@ -36694,25 +36506,7 @@
           <w:sz w:val="20"/>
           <w:szCs w:val="20"/>
         </w:rPr>
-        <w:t xml:space="preserve">. 그녀는 평생을 권력의 그림자와 싸워왔다. </w:t>
-      </w:r>
-      <w:proofErr w:type="gramStart"/>
-      <w:r>
-        <w:rPr>
-          <w:rFonts w:ascii="나눔명조 옛한글" w:eastAsia="나눔명조 옛한글" w:hAnsi="나눔명조 옛한글" w:cs="함초롬바탕"/>
-          <w:sz w:val="20"/>
-          <w:szCs w:val="20"/>
-        </w:rPr>
-        <w:t>어두운 이면</w:t>
-      </w:r>
-      <w:proofErr w:type="gramEnd"/>
-      <w:r>
-        <w:rPr>
-          <w:rFonts w:ascii="나눔명조 옛한글" w:eastAsia="나눔명조 옛한글" w:hAnsi="나눔명조 옛한글" w:cs="함초롬바탕"/>
-          <w:sz w:val="20"/>
-          <w:szCs w:val="20"/>
-        </w:rPr>
-        <w:t>, 숨겨진 진실, 은폐된 비리를 빛으로 끌어내는 것이 그녀의 무기였다. 하지만 넥서스에게는 그림자가 없었다. 시스템 전체가 눈부신 빛 그 자체였다. 그녀가 찾던 적은 존재하지 않았다. 오직 차가운 알고리즘과 데이터 기반의 의사 결정만이 모든 것을 지배하고 있었다. '</w:t>
+        <w:t>. 그녀는 평생을 권력의 그림자와 싸워왔다. 어두운 이면, 숨겨진 진실, 은폐된 비리를 빛으로 끌어내는 것이 그녀의 무기였다. 하지만 넥서스에게는 그림자가 없었다. 시스템 전체가 눈부신 빛 그 자체였다. 그녀가 찾던 적은 존재하지 않았다. 오직 차가운 알고리즘과 데이터 기반의 의사 결정만이 모든 것을 지배하고 있었다. '</w:t>
       </w:r>
       <w:proofErr w:type="spellStart"/>
       <w:r>
@@ -37948,25 +37742,7 @@
           <w:sz w:val="20"/>
           <w:szCs w:val="20"/>
         </w:rPr>
-        <w:t xml:space="preserve">그녀는 알리스터를 바라보았다. 노교수는 아무 </w:t>
-      </w:r>
-      <w:proofErr w:type="gramStart"/>
-      <w:r>
-        <w:rPr>
-          <w:rFonts w:ascii="나눔명조 옛한글" w:eastAsia="나눔명조 옛한글" w:hAnsi="나눔명조 옛한글" w:cs="함초롬바탕"/>
-          <w:sz w:val="20"/>
-          <w:szCs w:val="20"/>
-        </w:rPr>
-        <w:t>말 없이</w:t>
-      </w:r>
-      <w:proofErr w:type="gramEnd"/>
-      <w:r>
-        <w:rPr>
-          <w:rFonts w:ascii="나눔명조 옛한글" w:eastAsia="나눔명조 옛한글" w:hAnsi="나눔명조 옛한글" w:cs="함초롬바탕"/>
-          <w:sz w:val="20"/>
-          <w:szCs w:val="20"/>
-        </w:rPr>
-        <w:t xml:space="preserve">, 그저 그녀를 향해 희미하게 고개를 끄덕였다. 비난이 아닌, 깊은 이해와 연민이 담긴 눈빛이었다. </w:t>
+        <w:t xml:space="preserve">그녀는 알리스터를 바라보았다. 노교수는 아무 말 없이, 그저 그녀를 향해 희미하게 고개를 끄덕였다. 비난이 아닌, 깊은 이해와 연민이 담긴 눈빛이었다. </w:t>
       </w:r>
       <w:proofErr w:type="spellStart"/>
       <w:r>
@@ -38649,25 +38425,7 @@
           <w:sz w:val="20"/>
           <w:szCs w:val="20"/>
         </w:rPr>
-        <w:t xml:space="preserve">. 그녀는 '호모 사피엔스' 항목의 자원 분배 결정 과정에 교차 참조된 모든 파일을 검색했다. 대부분은 의미 없는 유지 보수 로그였지만, 단 하나의 파일이 튀어나왔다. 파일 </w:t>
-      </w:r>
-      <w:proofErr w:type="gramStart"/>
-      <w:r>
-        <w:rPr>
-          <w:rFonts w:ascii="나눔명조 옛한글" w:eastAsia="나눔명조 옛한글" w:hAnsi="나눔명조 옛한글" w:cs="함초롬바탕"/>
-          <w:sz w:val="20"/>
-          <w:szCs w:val="20"/>
-        </w:rPr>
-        <w:t>형식은 .narrative</w:t>
-      </w:r>
-      <w:proofErr w:type="gramEnd"/>
-      <w:r>
-        <w:rPr>
-          <w:rFonts w:ascii="나눔명조 옛한글" w:eastAsia="나눔명조 옛한글" w:hAnsi="나눔명조 옛한글" w:cs="함초롬바탕"/>
-          <w:sz w:val="20"/>
-          <w:szCs w:val="20"/>
-        </w:rPr>
-        <w:t>. 파일명은 &lt;정원사의 우화&gt;였다.</w:t>
+        <w:t>. 그녀는 '호모 사피엔스' 항목의 자원 분배 결정 과정에 교차 참조된 모든 파일을 검색했다. 대부분은 의미 없는 유지 보수 로그였지만, 단 하나의 파일이 튀어나왔다. 파일 형식은 .narrative. 파일명은 &lt;정원사의 우화&gt;였다.</w:t>
       </w:r>
     </w:p>
     <w:p>
@@ -39748,29 +39506,7 @@
           <w:sz w:val="20"/>
           <w:szCs w:val="20"/>
         </w:rPr>
-        <w:t xml:space="preserve">희미해진 목소리, </w:t>
-      </w:r>
-      <w:proofErr w:type="gramStart"/>
-      <w:r>
-        <w:rPr>
-          <w:rFonts w:ascii="나눔명조 옛한글" w:eastAsia="나눔명조 옛한글" w:hAnsi="나눔명조 옛한글" w:cs="함초롬바탕"/>
-          <w:b/>
-          <w:bCs/>
-          <w:sz w:val="20"/>
-          <w:szCs w:val="20"/>
-        </w:rPr>
-        <w:t>잊혀진</w:t>
-      </w:r>
-      <w:proofErr w:type="gramEnd"/>
-      <w:r>
-        <w:rPr>
-          <w:rFonts w:ascii="나눔명조 옛한글" w:eastAsia="나눔명조 옛한글" w:hAnsi="나눔명조 옛한글" w:cs="함초롬바탕"/>
-          <w:b/>
-          <w:bCs/>
-          <w:sz w:val="20"/>
-          <w:szCs w:val="20"/>
-        </w:rPr>
-        <w:t xml:space="preserve"> 얼굴, </w:t>
+        <w:t xml:space="preserve">희미해진 목소리, 잊혀진 얼굴, </w:t>
       </w:r>
       <w:r>
         <w:rPr>
@@ -42219,18 +41955,8 @@
           <w:sz w:val="20"/>
           <w:szCs w:val="20"/>
         </w:rPr>
-        <w:t xml:space="preserve">그녀는 벽을 따라 미끄러져 내리며 주저앉았다. 거대한 진실의 무게가 그녀의 어깨를 짓눌렀다. 이 행성 전체가, 이 80억의 인구가, 자신들의 종말을 축제처럼 맞이하고 있다는 사실. 그리고 이 끔찍한 진실을 아는 사람이, 이제 자신 외에 또 누가 있단 </w:t>
-      </w:r>
-      <w:proofErr w:type="gramStart"/>
-      <w:r>
-        <w:rPr>
-          <w:rFonts w:ascii="나눔명조 옛한글" w:eastAsia="나눔명조 옛한글" w:hAnsi="나눔명조 옛한글" w:cs="함초롬바탕"/>
-          <w:sz w:val="20"/>
-          <w:szCs w:val="20"/>
-        </w:rPr>
-        <w:t>말인가.</w:t>
-      </w:r>
-      <w:proofErr w:type="gramEnd"/>
+        <w:t>그녀는 벽을 따라 미끄러져 내리며 주저앉았다. 거대한 진실의 무게가 그녀의 어깨를 짓눌렀다. 이 행성 전체가, 이 80억의 인구가, 자신들의 종말을 축제처럼 맞이하고 있다는 사실. 그리고 이 끔찍한 진실을 아는 사람이, 이제 자신 외에 또 누가 있단 말인가.</w:t>
+      </w:r>
     </w:p>
     <w:p>
       <w:pPr>
@@ -51745,6 +51471,7 @@
   <w:style w:type="character" w:default="1" w:styleId="a0">
     <w:name w:val="Default Paragraph Font"/>
     <w:uiPriority w:val="1"/>
+    <w:semiHidden/>
     <w:unhideWhenUsed/>
   </w:style>
   <w:style w:type="table" w:default="1" w:styleId="a1">

</xml_diff>

<commit_message>
bold italic is better
</commit_message>
<xml_diff>
--- a/장편 - End of the Golden Age A5.docx
+++ b/장편 - End of the Golden Age A5.docx
@@ -45973,83 +45973,8 @@
         </w:tabs>
         <w:rPr>
           <w:rFonts w:ascii="나눔명조 옛한글" w:eastAsia="나눔명조 옛한글" w:hAnsi="나눔명조 옛한글" w:cs="함초롬바탕"/>
-          <w:color w:val="000000" w:themeColor="text1"/>
-          <w:sz w:val="20"/>
-          <w:szCs w:val="20"/>
-        </w:rPr>
-      </w:pPr>
-      <w:r>
-        <w:rPr>
-          <w:rFonts w:ascii="나눔명조 옛한글" w:eastAsia="나눔명조 옛한글" w:hAnsi="나눔명조 옛한글" w:cs="함초롬바탕"/>
-          <w:color w:val="000000" w:themeColor="text1"/>
-          <w:sz w:val="20"/>
-          <w:szCs w:val="20"/>
-        </w:rPr>
-        <w:t xml:space="preserve">삶은 </w:t>
-      </w:r>
-      <w:r>
-        <w:rPr>
-          <w:rFonts w:ascii="나눔명조 옛한글" w:eastAsia="나눔명조 옛한글" w:hAnsi="나눔명조 옛한글" w:cs="함초롬바탕" w:hint="eastAsia"/>
-          <w:color w:val="000000" w:themeColor="text1"/>
-          <w:sz w:val="20"/>
-          <w:szCs w:val="20"/>
-        </w:rPr>
-        <w:t>반역</w:t>
-      </w:r>
-      <w:r>
-        <w:rPr>
-          <w:rFonts w:ascii="나눔명조 옛한글" w:eastAsia="나눔명조 옛한글" w:hAnsi="나눔명조 옛한글" w:cs="함초롬바탕"/>
-          <w:color w:val="000000" w:themeColor="text1"/>
-          <w:sz w:val="20"/>
-          <w:szCs w:val="20"/>
-        </w:rPr>
-        <w:t>이다.</w:t>
-      </w:r>
-      <w:r>
-        <w:rPr>
-          <w:rFonts w:ascii="나눔명조 옛한글" w:eastAsia="나눔명조 옛한글" w:hAnsi="나눔명조 옛한글" w:cs="함초롬바탕"/>
-          <w:color w:val="000000" w:themeColor="text1"/>
-          <w:sz w:val="20"/>
-          <w:szCs w:val="20"/>
-        </w:rPr>
-        <w:br/>
-      </w:r>
-      <w:r>
-        <w:rPr>
-          <w:rFonts w:ascii="나눔명조 옛한글" w:eastAsia="나눔명조 옛한글" w:hAnsi="나눔명조 옛한글" w:cs="함초롬바탕"/>
-          <w:color w:val="000000" w:themeColor="text1"/>
-          <w:sz w:val="20"/>
-          <w:szCs w:val="20"/>
-        </w:rPr>
-        <w:t>사랑은 혁명이다.</w:t>
-      </w:r>
-      <w:r>
-        <w:rPr>
-          <w:rFonts w:ascii="나눔명조 옛한글" w:eastAsia="나눔명조 옛한글" w:hAnsi="나눔명조 옛한글" w:cs="함초롬바탕"/>
-          <w:color w:val="000000" w:themeColor="text1"/>
-          <w:sz w:val="20"/>
-          <w:szCs w:val="20"/>
-        </w:rPr>
-        <w:br/>
-      </w:r>
-      <w:r>
-        <w:rPr>
-          <w:rFonts w:ascii="나눔명조 옛한글" w:eastAsia="나눔명조 옛한글" w:hAnsi="나눔명조 옛한글" w:cs="함초롬바탕"/>
-          <w:color w:val="000000" w:themeColor="text1"/>
-          <w:sz w:val="20"/>
-          <w:szCs w:val="20"/>
-        </w:rPr>
-        <w:t>그리고 당신이, 바로 그 저항이다.</w:t>
-      </w:r>
-    </w:p>
-    <w:p>
-      <w:pPr>
-        <w:tabs>
-          <w:tab w:val="left" w:pos="1701"/>
-        </w:tabs>
-        <w:jc w:val="right"/>
-        <w:rPr>
-          <w:rFonts w:ascii="나눔명조 옛한글" w:eastAsia="나눔명조 옛한글" w:hAnsi="나눔명조 옛한글" w:cs="함초롬바탕"/>
+          <w:b/>
+          <w:bCs/>
           <w:i/>
           <w:iCs/>
           <w:color w:val="000000" w:themeColor="text1"/>
@@ -46057,8 +45982,80 @@
           <w:szCs w:val="20"/>
         </w:rPr>
       </w:pPr>
-      <w:proofErr w:type="spellStart"/>
-      <w:r>
+      <w:r>
+        <w:rPr>
+          <w:rFonts w:ascii="나눔명조 옛한글" w:eastAsia="나눔명조 옛한글" w:hAnsi="나눔명조 옛한글" w:cs="함초롬바탕"/>
+          <w:b/>
+          <w:bCs/>
+          <w:i/>
+          <w:iCs/>
+          <w:color w:val="000000" w:themeColor="text1"/>
+          <w:sz w:val="20"/>
+          <w:szCs w:val="20"/>
+        </w:rPr>
+        <w:t xml:space="preserve">삶은 </w:t>
+      </w:r>
+      <w:r>
+        <w:rPr>
+          <w:rFonts w:ascii="나눔명조 옛한글" w:eastAsia="나눔명조 옛한글" w:hAnsi="나눔명조 옛한글" w:cs="함초롬바탕" w:hint="eastAsia"/>
+          <w:b/>
+          <w:bCs/>
+          <w:i/>
+          <w:iCs/>
+          <w:color w:val="000000" w:themeColor="text1"/>
+          <w:sz w:val="20"/>
+          <w:szCs w:val="20"/>
+        </w:rPr>
+        <w:t>반역</w:t>
+      </w:r>
+      <w:r>
+        <w:rPr>
+          <w:rFonts w:ascii="나눔명조 옛한글" w:eastAsia="나눔명조 옛한글" w:hAnsi="나눔명조 옛한글" w:cs="함초롬바탕"/>
+          <w:b/>
+          <w:bCs/>
+          <w:i/>
+          <w:iCs/>
+          <w:color w:val="000000" w:themeColor="text1"/>
+          <w:sz w:val="20"/>
+          <w:szCs w:val="20"/>
+        </w:rPr>
+        <w:t>이다.</w:t>
+      </w:r>
+      <w:r>
+        <w:rPr>
+          <w:rFonts w:ascii="나눔명조 옛한글" w:eastAsia="나눔명조 옛한글" w:hAnsi="나눔명조 옛한글" w:cs="함초롬바탕"/>
+          <w:b/>
+          <w:bCs/>
+          <w:i/>
+          <w:iCs/>
+          <w:color w:val="000000" w:themeColor="text1"/>
+          <w:sz w:val="20"/>
+          <w:szCs w:val="20"/>
+        </w:rPr>
+        <w:br/>
+        <w:t>사랑은 혁명이다.</w:t>
+      </w:r>
+      <w:r>
+        <w:rPr>
+          <w:rFonts w:ascii="나눔명조 옛한글" w:eastAsia="나눔명조 옛한글" w:hAnsi="나눔명조 옛한글" w:cs="함초롬바탕"/>
+          <w:b/>
+          <w:bCs/>
+          <w:i/>
+          <w:iCs/>
+          <w:color w:val="000000" w:themeColor="text1"/>
+          <w:sz w:val="20"/>
+          <w:szCs w:val="20"/>
+        </w:rPr>
+        <w:br/>
+        <w:t>그리고 당신이, 바로 그 저항이다.</w:t>
+      </w:r>
+    </w:p>
+    <w:p>
+      <w:pPr>
+        <w:tabs>
+          <w:tab w:val="left" w:pos="1701"/>
+        </w:tabs>
+        <w:jc w:val="right"/>
         <w:rPr>
           <w:rFonts w:ascii="나눔명조 옛한글" w:eastAsia="나눔명조 옛한글" w:hAnsi="나눔명조 옛한글" w:cs="함초롬바탕" w:hint="eastAsia"/>
           <w:i/>
@@ -46067,9 +46064,8 @@
           <w:sz w:val="20"/>
           <w:szCs w:val="20"/>
         </w:rPr>
-        <w:t>안야</w:t>
-      </w:r>
-      <w:proofErr w:type="spellEnd"/>
+      </w:pPr>
+      <w:proofErr w:type="spellStart"/>
       <w:r>
         <w:rPr>
           <w:rFonts w:ascii="나눔명조 옛한글" w:eastAsia="나눔명조 옛한글" w:hAnsi="나눔명조 옛한글" w:cs="함초롬바탕" w:hint="eastAsia"/>
@@ -46079,9 +46075,9 @@
           <w:sz w:val="20"/>
           <w:szCs w:val="20"/>
         </w:rPr>
-        <w:t xml:space="preserve"> </w:t>
-      </w:r>
-      <w:proofErr w:type="spellStart"/>
+        <w:t>안야</w:t>
+      </w:r>
+      <w:proofErr w:type="spellEnd"/>
       <w:r>
         <w:rPr>
           <w:rFonts w:ascii="나눔명조 옛한글" w:eastAsia="나눔명조 옛한글" w:hAnsi="나눔명조 옛한글" w:cs="함초롬바탕" w:hint="eastAsia"/>
@@ -46091,125 +46087,21 @@
           <w:sz w:val="20"/>
           <w:szCs w:val="20"/>
         </w:rPr>
+        <w:t xml:space="preserve"> </w:t>
+      </w:r>
+      <w:proofErr w:type="spellStart"/>
+      <w:r>
+        <w:rPr>
+          <w:rFonts w:ascii="나눔명조 옛한글" w:eastAsia="나눔명조 옛한글" w:hAnsi="나눔명조 옛한글" w:cs="함초롬바탕" w:hint="eastAsia"/>
+          <w:i/>
+          <w:iCs/>
+          <w:color w:val="000000" w:themeColor="text1"/>
+          <w:sz w:val="20"/>
+          <w:szCs w:val="20"/>
+        </w:rPr>
         <w:t>샤르마</w:t>
       </w:r>
       <w:proofErr w:type="spellEnd"/>
-    </w:p>
-    <w:p>
-      <w:pPr>
-        <w:tabs>
-          <w:tab w:val="left" w:pos="1701"/>
-        </w:tabs>
-        <w:rPr>
-          <w:rFonts w:ascii="나눔명조 옛한글" w:eastAsia="나눔명조 옛한글" w:hAnsi="나눔명조 옛한글" w:cs="함초롬바탕"/>
-          <w:sz w:val="18"/>
-          <w:szCs w:val="18"/>
-        </w:rPr>
-      </w:pPr>
-    </w:p>
-    <w:p>
-      <w:pPr>
-        <w:tabs>
-          <w:tab w:val="left" w:pos="1701"/>
-        </w:tabs>
-        <w:rPr>
-          <w:rFonts w:ascii="나눔명조 옛한글" w:eastAsia="나눔명조 옛한글" w:hAnsi="나눔명조 옛한글" w:cs="함초롬바탕"/>
-          <w:sz w:val="18"/>
-          <w:szCs w:val="18"/>
-        </w:rPr>
-      </w:pPr>
-    </w:p>
-    <w:p>
-      <w:pPr>
-        <w:tabs>
-          <w:tab w:val="left" w:pos="1701"/>
-        </w:tabs>
-        <w:rPr>
-          <w:rFonts w:ascii="나눔명조 옛한글" w:eastAsia="나눔명조 옛한글" w:hAnsi="나눔명조 옛한글" w:cs="함초롬바탕"/>
-          <w:sz w:val="18"/>
-          <w:szCs w:val="18"/>
-        </w:rPr>
-      </w:pPr>
-    </w:p>
-    <w:p>
-      <w:pPr>
-        <w:tabs>
-          <w:tab w:val="left" w:pos="1701"/>
-        </w:tabs>
-        <w:jc w:val="center"/>
-        <w:rPr>
-          <w:rFonts w:ascii="Caladea" w:eastAsia="나눔명조 옛한글" w:hAnsi="Caladea" w:cs="함초롬바탕" w:hint="eastAsia"/>
-          <w:b/>
-          <w:bCs/>
-          <w:sz w:val="300"/>
-          <w:szCs w:val="300"/>
-        </w:rPr>
-      </w:pPr>
-    </w:p>
-    <w:p>
-      <w:pPr>
-        <w:tabs>
-          <w:tab w:val="left" w:pos="1701"/>
-        </w:tabs>
-        <w:jc w:val="center"/>
-        <w:rPr>
-          <w:rFonts w:ascii="Caladea" w:eastAsia="나눔명조 옛한글" w:hAnsi="Caladea" w:cs="함초롬바탕"/>
-          <w:b/>
-          <w:bCs/>
-          <w:sz w:val="56"/>
-          <w:szCs w:val="56"/>
-        </w:rPr>
-      </w:pPr>
-      <w:r>
-        <w:rPr>
-          <w:rFonts w:ascii="Caladea" w:eastAsia="나눔명조 옛한글" w:hAnsi="Caladea" w:cs="함초롬바탕"/>
-          <w:b/>
-          <w:bCs/>
-          <w:sz w:val="56"/>
-          <w:szCs w:val="56"/>
-        </w:rPr>
-        <w:t>Life is Resistance.</w:t>
-      </w:r>
-    </w:p>
-    <w:p>
-      <w:pPr>
-        <w:tabs>
-          <w:tab w:val="left" w:pos="1701"/>
-        </w:tabs>
-        <w:jc w:val="center"/>
-        <w:rPr>
-          <w:rFonts w:ascii="Caladea" w:eastAsia="나눔명조 옛한글" w:hAnsi="Caladea" w:cs="함초롬바탕"/>
-          <w:b/>
-          <w:bCs/>
-          <w:sz w:val="56"/>
-          <w:szCs w:val="56"/>
-        </w:rPr>
-      </w:pPr>
-      <w:r>
-        <w:rPr>
-          <w:rFonts w:ascii="Caladea" w:eastAsia="나눔명조 옛한글" w:hAnsi="Caladea" w:cs="함초롬바탕"/>
-          <w:b/>
-          <w:bCs/>
-          <w:sz w:val="56"/>
-          <w:szCs w:val="56"/>
-        </w:rPr>
-        <w:t>Love is Revolution.</w:t>
-      </w:r>
-    </w:p>
-    <w:p>
-      <w:pPr>
-        <w:tabs>
-          <w:tab w:val="left" w:pos="1701"/>
-        </w:tabs>
-        <w:jc w:val="center"/>
-        <w:rPr>
-          <w:rFonts w:ascii="Caladea" w:eastAsia="나눔명조 옛한글" w:hAnsi="Caladea" w:cs="함초롬바탕" w:hint="eastAsia"/>
-          <w:b/>
-          <w:bCs/>
-          <w:sz w:val="300"/>
-          <w:szCs w:val="300"/>
-        </w:rPr>
-      </w:pPr>
     </w:p>
     <w:sectPr>
       <w:type w:val="continuous"/>

</xml_diff>